<commit_message>
Atualizando os arquivos corretos com gitignore
</commit_message>
<xml_diff>
--- a/GeradorAvisoReuniao/GeradorAvisoReuniao/Templates/ModeloAviso.docx
+++ b/GeradorAvisoReuniao/GeradorAvisoReuniao/Templates/ModeloAviso.docx
@@ -84,25 +84,7 @@
           <w:sz w:val="40"/>
           <w:szCs w:val="40"/>
         </w:rPr>
-        <w:t>{{</w:t>
-      </w:r>
-      <w:proofErr w:type="spellStart"/>
-      <w:r>
-        <w:rPr>
-          <w:rFonts w:ascii="Arial" w:hAnsi="Arial" w:cs="Arial"/>
-          <w:sz w:val="40"/>
-          <w:szCs w:val="40"/>
-        </w:rPr>
-        <w:t>PriChamada</w:t>
-      </w:r>
-      <w:proofErr w:type="spellEnd"/>
-      <w:r>
-        <w:rPr>
-          <w:rFonts w:ascii="Arial" w:hAnsi="Arial" w:cs="Arial"/>
-          <w:sz w:val="40"/>
-          <w:szCs w:val="40"/>
-        </w:rPr>
-        <w:t>}}</w:t>
+        <w:t>{{PriChamada}}</w:t>
       </w:r>
     </w:p>
     <w:p>
@@ -120,7 +102,7 @@
           <w:sz w:val="40"/>
           <w:szCs w:val="40"/>
         </w:rPr>
-        <w:t xml:space="preserve">2ª Chamada: </w:t>
+        <w:t>2ª Chamada:</w:t>
       </w:r>
       <w:r>
         <w:rPr>
@@ -128,25 +110,15 @@
           <w:sz w:val="40"/>
           <w:szCs w:val="40"/>
         </w:rPr>
-        <w:t>{{</w:t>
+        <w:t xml:space="preserve"> </w:t>
       </w:r>
-      <w:proofErr w:type="spellStart"/>
       <w:r>
         <w:rPr>
           <w:rFonts w:ascii="Arial" w:hAnsi="Arial" w:cs="Arial"/>
           <w:sz w:val="40"/>
           <w:szCs w:val="40"/>
         </w:rPr>
-        <w:t>SegChamada</w:t>
-      </w:r>
-      <w:proofErr w:type="spellEnd"/>
-      <w:r>
-        <w:rPr>
-          <w:rFonts w:ascii="Arial" w:hAnsi="Arial" w:cs="Arial"/>
-          <w:sz w:val="40"/>
-          <w:szCs w:val="40"/>
-        </w:rPr>
-        <w:t>}}</w:t>
+        <w:t>{{SegChamada}}</w:t>
       </w:r>
     </w:p>
     <w:p>
@@ -178,6 +150,11 @@
     </w:p>
     <w:p>
       <w:pPr>
+        <w:pStyle w:val="PargrafodaLista"/>
+        <w:numPr>
+          <w:ilvl w:val="0"/>
+          <w:numId w:val="2"/>
+        </w:numPr>
         <w:jc w:val="both"/>
         <w:rPr>
           <w:rFonts w:ascii="Arial" w:hAnsi="Arial" w:cs="Arial"/>
@@ -227,32 +204,6 @@
           <w:sz w:val="40"/>
           <w:szCs w:val="40"/>
         </w:rPr>
-        <w:t xml:space="preserve"> {</w:t>
-      </w:r>
-      <w:proofErr w:type="gramStart"/>
-      <w:r>
-        <w:rPr>
-          <w:rFonts w:ascii="Arial" w:hAnsi="Arial" w:cs="Arial"/>
-          <w:sz w:val="40"/>
-          <w:szCs w:val="40"/>
-        </w:rPr>
-        <w:t>{Local</w:t>
-      </w:r>
-      <w:proofErr w:type="gramEnd"/>
-      <w:r>
-        <w:rPr>
-          <w:rFonts w:ascii="Arial" w:hAnsi="Arial" w:cs="Arial"/>
-          <w:sz w:val="40"/>
-          <w:szCs w:val="40"/>
-        </w:rPr>
-        <w:t>}}</w:t>
-      </w:r>
-      <w:r>
-        <w:rPr>
-          <w:rFonts w:ascii="Arial" w:hAnsi="Arial" w:cs="Arial"/>
-          <w:sz w:val="40"/>
-          <w:szCs w:val="40"/>
-        </w:rPr>
         <w:t xml:space="preserve"> </w:t>
       </w:r>
       <w:r>
@@ -261,7 +212,7 @@
           <w:sz w:val="40"/>
           <w:szCs w:val="40"/>
         </w:rPr>
-        <w:t xml:space="preserve"> </w:t>
+        <w:t>{{Local}}</w:t>
       </w:r>
     </w:p>
     <w:p>
@@ -384,8 +335,97 @@
       </w:pPr>
     </w:lvl>
   </w:abstractNum>
+  <w:abstractNum w:abstractNumId="1" w15:restartNumberingAfterBreak="0">
+    <w:nsid w:val="6F8463B6"/>
+    <w:multiLevelType w:val="hybridMultilevel"/>
+    <w:tmpl w:val="14B60BB4"/>
+    <w:lvl w:ilvl="0" w:tplc="0416000F">
+      <w:start w:val="1"/>
+      <w:numFmt w:val="decimal"/>
+      <w:lvlText w:val="%1."/>
+      <w:lvlJc w:val="left"/>
+      <w:pPr>
+        <w:ind w:left="720" w:hanging="360"/>
+      </w:pPr>
+    </w:lvl>
+    <w:lvl w:ilvl="1" w:tplc="04160019" w:tentative="1">
+      <w:start w:val="1"/>
+      <w:numFmt w:val="lowerLetter"/>
+      <w:lvlText w:val="%2."/>
+      <w:lvlJc w:val="left"/>
+      <w:pPr>
+        <w:ind w:left="1440" w:hanging="360"/>
+      </w:pPr>
+    </w:lvl>
+    <w:lvl w:ilvl="2" w:tplc="0416001B" w:tentative="1">
+      <w:start w:val="1"/>
+      <w:numFmt w:val="lowerRoman"/>
+      <w:lvlText w:val="%3."/>
+      <w:lvlJc w:val="right"/>
+      <w:pPr>
+        <w:ind w:left="2160" w:hanging="180"/>
+      </w:pPr>
+    </w:lvl>
+    <w:lvl w:ilvl="3" w:tplc="0416000F" w:tentative="1">
+      <w:start w:val="1"/>
+      <w:numFmt w:val="decimal"/>
+      <w:lvlText w:val="%4."/>
+      <w:lvlJc w:val="left"/>
+      <w:pPr>
+        <w:ind w:left="2880" w:hanging="360"/>
+      </w:pPr>
+    </w:lvl>
+    <w:lvl w:ilvl="4" w:tplc="04160019" w:tentative="1">
+      <w:start w:val="1"/>
+      <w:numFmt w:val="lowerLetter"/>
+      <w:lvlText w:val="%5."/>
+      <w:lvlJc w:val="left"/>
+      <w:pPr>
+        <w:ind w:left="3600" w:hanging="360"/>
+      </w:pPr>
+    </w:lvl>
+    <w:lvl w:ilvl="5" w:tplc="0416001B" w:tentative="1">
+      <w:start w:val="1"/>
+      <w:numFmt w:val="lowerRoman"/>
+      <w:lvlText w:val="%6."/>
+      <w:lvlJc w:val="right"/>
+      <w:pPr>
+        <w:ind w:left="4320" w:hanging="180"/>
+      </w:pPr>
+    </w:lvl>
+    <w:lvl w:ilvl="6" w:tplc="0416000F" w:tentative="1">
+      <w:start w:val="1"/>
+      <w:numFmt w:val="decimal"/>
+      <w:lvlText w:val="%7."/>
+      <w:lvlJc w:val="left"/>
+      <w:pPr>
+        <w:ind w:left="5040" w:hanging="360"/>
+      </w:pPr>
+    </w:lvl>
+    <w:lvl w:ilvl="7" w:tplc="04160019" w:tentative="1">
+      <w:start w:val="1"/>
+      <w:numFmt w:val="lowerLetter"/>
+      <w:lvlText w:val="%8."/>
+      <w:lvlJc w:val="left"/>
+      <w:pPr>
+        <w:ind w:left="5760" w:hanging="360"/>
+      </w:pPr>
+    </w:lvl>
+    <w:lvl w:ilvl="8" w:tplc="0416001B" w:tentative="1">
+      <w:start w:val="1"/>
+      <w:numFmt w:val="lowerRoman"/>
+      <w:lvlText w:val="%9."/>
+      <w:lvlJc w:val="right"/>
+      <w:pPr>
+        <w:ind w:left="6480" w:hanging="180"/>
+      </w:pPr>
+    </w:lvl>
+  </w:abstractNum>
   <w:num w:numId="1">
     <w:abstractNumId w:val="0"/>
+  </w:num>
+  <w:num w:numId="2">
+    <w:abstractNumId w:val="1"/>
   </w:num>
 </w:numbering>
 </file>

</xml_diff>